<commit_message>
a lot of modifications
</commit_message>
<xml_diff>
--- a/Liquid+ Project/Sélection des startups/modèle général des messages aux startups (1ère ligne à créer).docx
+++ b/Liquid+ Project/Sélection des startups/modèle général des messages aux startups (1ère ligne à créer).docx
@@ -45,28 +45,60 @@
     </w:p>
     <w:p/>
     <w:p>
-      <w:r>
-        <w:t>Nous sommes joignables à</w:t>
-      </w:r>
-      <w:r>
-        <w:t> :</w:t>
-      </w:r>
-    </w:p>
-    <w:p>
-      <w:r>
-        <w:t>liquidplus.fr</w:t>
-      </w:r>
-    </w:p>
-    <w:p>
-      <w:r>
+      <w:pPr>
+        <w:shd w:val="clear" w:color="auto" w:fill="FFFFFF"/>
+        <w:spacing w:line="211" w:lineRule="atLeast"/>
+        <w:rPr>
+          <w:rFonts w:ascii="Calibri" w:eastAsia="Times New Roman" w:hAnsi="Calibri" w:cs="Calibri"/>
+          <w:color w:val="222222"/>
+        </w:rPr>
+      </w:pPr>
+      <w:hyperlink r:id="rId4" w:tgtFrame="_blank" w:history="1">
+        <w:r>
+          <w:rPr>
+            <w:rFonts w:ascii="Calibri" w:eastAsia="Times New Roman" w:hAnsi="Calibri" w:cs="Calibri"/>
+            <w:color w:val="0000FF"/>
+            <w:u w:val="single"/>
+          </w:rPr>
+          <w:t>liquidplus.fr</w:t>
+        </w:r>
+      </w:hyperlink>
+    </w:p>
+    <w:p>
+      <w:pPr>
+        <w:shd w:val="clear" w:color="auto" w:fill="FFFFFF"/>
+        <w:spacing w:line="211" w:lineRule="atLeast"/>
+        <w:rPr>
+          <w:rFonts w:ascii="Calibri" w:eastAsia="Times New Roman" w:hAnsi="Calibri" w:cs="Calibri"/>
+          <w:color w:val="222222"/>
+        </w:rPr>
+      </w:pPr>
+      <w:r>
+        <w:rPr>
+          <w:rFonts w:ascii="Calibri" w:eastAsia="Times New Roman" w:hAnsi="Calibri" w:cs="Calibri"/>
+          <w:color w:val="222222"/>
+        </w:rPr>
         <w:t>06 48 17 63 23</w:t>
       </w:r>
     </w:p>
     <w:p>
-      <w:r>
+      <w:pPr>
+        <w:shd w:val="clear" w:color="auto" w:fill="FFFFFF"/>
+        <w:spacing w:line="211" w:lineRule="atLeast"/>
+        <w:rPr>
+          <w:rFonts w:ascii="Calibri" w:eastAsia="Times New Roman" w:hAnsi="Calibri" w:cs="Calibri"/>
+          <w:color w:val="222222"/>
+        </w:rPr>
+      </w:pPr>
+      <w:r>
+        <w:rPr>
+          <w:rFonts w:ascii="Calibri" w:eastAsia="Times New Roman" w:hAnsi="Calibri" w:cs="Calibri"/>
+          <w:color w:val="222222"/>
+        </w:rPr>
         <w:t>07 69 66 45 31</w:t>
       </w:r>
     </w:p>
+    <w:p/>
     <w:p/>
     <w:sectPr>
       <w:pgSz w:w="11906" w:h="16838"/>
@@ -267,6 +299,34 @@
     <w:semiHidden/>
     <w:unhideWhenUsed/>
   </w:style>
+  <w:style w:type="character" w:styleId="Lienhypertexte">
+    <w:name w:val="Hyperlink"/>
+    <w:basedOn w:val="Policepardfaut"/>
+    <w:uiPriority w:val="99"/>
+    <w:semiHidden/>
+    <w:unhideWhenUsed/>
+    <w:rsid w:val="00295D9D"/>
+    <w:rPr>
+      <w:color w:val="0000FF"/>
+      <w:u w:val="single"/>
+    </w:rPr>
+  </w:style>
+  <w:style w:type="paragraph" w:styleId="NormalWeb">
+    <w:name w:val="Normal (Web)"/>
+    <w:basedOn w:val="Normal"/>
+    <w:uiPriority w:val="99"/>
+    <w:semiHidden/>
+    <w:unhideWhenUsed/>
+    <w:rsid w:val="006A2B2C"/>
+    <w:pPr>
+      <w:spacing w:before="100" w:beforeAutospacing="1" w:after="100" w:afterAutospacing="1" w:line="240" w:lineRule="auto"/>
+    </w:pPr>
+    <w:rPr>
+      <w:rFonts w:ascii="Times New Roman" w:eastAsia="Times New Roman" w:hAnsi="Times New Roman" w:cs="Times New Roman"/>
+      <w:sz w:val="24"/>
+      <w:szCs w:val="24"/>
+    </w:rPr>
+  </w:style>
 </w:styles>
 </file>
 

</xml_diff>